<commit_message>
docs: add AEM DAM guide screenshots
</commit_message>
<xml_diff>
--- a/docs/deliverables/理想汽车海外官网AEM_EDS_DAM架构设计与使用指南_V1.0.docx
+++ b/docs/deliverables/理想汽车海外官网AEM_EDS_DAM架构设计与使用指南_V1.0.docx
@@ -2817,6 +2817,60 @@
           <w:sz w:val="17"/>
         </w:rPr>
         <w:t>图 2  DAM 治理架构与边界</w:t>
+      </w:r>
+    </w:p>
+    <w:p>
+      <w:pPr>
+        <w:spacing w:before="100" w:after="60"/>
+        <w:jc w:val="center"/>
+      </w:pPr>
+      <w:r>
+        <w:drawing>
+          <wp:inline xmlns:a="http://schemas.openxmlformats.org/drawingml/2006/main" xmlns:pic="http://schemas.openxmlformats.org/drawingml/2006/picture">
+            <wp:extent cx="3337560" cy="5741266"/>
+            <wp:docPr id="3" name="Picture 3" title="leadstec-dev 中的 li-auto DAM 根目录" descr="leadstec-dev 中的 li-auto DAM 根目录"/>
+            <wp:cNvGraphicFramePr>
+              <a:graphicFrameLocks noChangeAspect="1"/>
+            </wp:cNvGraphicFramePr>
+            <a:graphic>
+              <a:graphicData uri="http://schemas.openxmlformats.org/drawingml/2006/picture">
+                <pic:pic>
+                  <pic:nvPicPr>
+                    <pic:cNvPr id="0" name="01-dam-root.png"/>
+                    <pic:cNvPicPr/>
+                  </pic:nvPicPr>
+                  <pic:blipFill>
+                    <a:blip r:embed="rId13"/>
+                    <a:stretch>
+                      <a:fillRect/>
+                    </a:stretch>
+                  </pic:blipFill>
+                  <pic:spPr>
+                    <a:xfrm>
+                      <a:off x="0" y="0"/>
+                      <a:ext cx="3337560" cy="5741266"/>
+                    </a:xfrm>
+                    <a:prstGeom prst="rect"/>
+                  </pic:spPr>
+                </pic:pic>
+              </a:graphicData>
+            </a:graphic>
+          </wp:inline>
+        </w:drawing>
+      </w:r>
+    </w:p>
+    <w:p>
+      <w:pPr>
+        <w:spacing w:after="140"/>
+        <w:jc w:val="center"/>
+      </w:pPr>
+      <w:r>
+        <w:rPr>
+          <w:rFonts w:ascii="Heiti SC" w:hAnsi="Heiti SC" w:eastAsia="Heiti SC"/>
+          <w:color w:val="666666"/>
+          <w:sz w:val="17"/>
+        </w:rPr>
+        <w:t>图 3　AEM Assets 中已落地的 `/content/dam/li-auto` 根目录。五个顶层目录与治理设计一致。</w:t>
       </w:r>
     </w:p>
     <w:p>
@@ -3356,6 +3410,114 @@
       <w:pPr>
         <w:spacing w:after="20"/>
       </w:pPr>
+    </w:p>
+    <w:p>
+      <w:pPr>
+        <w:spacing w:before="100" w:after="60"/>
+        <w:jc w:val="center"/>
+      </w:pPr>
+      <w:r>
+        <w:drawing>
+          <wp:inline xmlns:a="http://schemas.openxmlformats.org/drawingml/2006/main" xmlns:pic="http://schemas.openxmlformats.org/drawingml/2006/picture">
+            <wp:extent cx="3337560" cy="5741266"/>
+            <wp:docPr id="4" name="Picture 4" title="shared 共享资产目录" descr="shared 共享资产目录"/>
+            <wp:cNvGraphicFramePr>
+              <a:graphicFrameLocks noChangeAspect="1"/>
+            </wp:cNvGraphicFramePr>
+            <a:graphic>
+              <a:graphicData uri="http://schemas.openxmlformats.org/drawingml/2006/picture">
+                <pic:pic>
+                  <pic:nvPicPr>
+                    <pic:cNvPr id="0" name="02-shared-root.png"/>
+                    <pic:cNvPicPr/>
+                  </pic:nvPicPr>
+                  <pic:blipFill>
+                    <a:blip r:embed="rId14"/>
+                    <a:stretch>
+                      <a:fillRect/>
+                    </a:stretch>
+                  </pic:blipFill>
+                  <pic:spPr>
+                    <a:xfrm>
+                      <a:off x="0" y="0"/>
+                      <a:ext cx="3337560" cy="5741266"/>
+                    </a:xfrm>
+                    <a:prstGeom prst="rect"/>
+                  </pic:spPr>
+                </pic:pic>
+              </a:graphicData>
+            </a:graphic>
+          </wp:inline>
+        </w:drawing>
+      </w:r>
+    </w:p>
+    <w:p>
+      <w:pPr>
+        <w:spacing w:after="140"/>
+        <w:jc w:val="center"/>
+      </w:pPr>
+      <w:r>
+        <w:rPr>
+          <w:rFonts w:ascii="Heiti SC" w:hAnsi="Heiti SC" w:eastAsia="Heiti SC"/>
+          <w:color w:val="666666"/>
+          <w:sz w:val="17"/>
+        </w:rPr>
+        <w:t>图 4　`shared` 下的品牌、车型、技术、企业和文档资产边界。卡片缩略图来自已完成处理的实际资产。</w:t>
+      </w:r>
+    </w:p>
+    <w:p>
+      <w:pPr>
+        <w:spacing w:before="100" w:after="60"/>
+        <w:jc w:val="center"/>
+      </w:pPr>
+      <w:r>
+        <w:drawing>
+          <wp:inline xmlns:a="http://schemas.openxmlformats.org/drawingml/2006/main" xmlns:pic="http://schemas.openxmlformats.org/drawingml/2006/picture">
+            <wp:extent cx="3337560" cy="5741266"/>
+            <wp:docPr id="5" name="Picture 5" title="车型共享资产目录" descr="车型共享资产目录"/>
+            <wp:cNvGraphicFramePr>
+              <a:graphicFrameLocks noChangeAspect="1"/>
+            </wp:cNvGraphicFramePr>
+            <a:graphic>
+              <a:graphicData uri="http://schemas.openxmlformats.org/drawingml/2006/picture">
+                <pic:pic>
+                  <pic:nvPicPr>
+                    <pic:cNvPr id="0" name="03-shared-vehicles.png"/>
+                    <pic:cNvPicPr/>
+                  </pic:nvPicPr>
+                  <pic:blipFill>
+                    <a:blip r:embed="rId15"/>
+                    <a:stretch>
+                      <a:fillRect/>
+                    </a:stretch>
+                  </pic:blipFill>
+                  <pic:spPr>
+                    <a:xfrm>
+                      <a:off x="0" y="0"/>
+                      <a:ext cx="3337560" cy="5741266"/>
+                    </a:xfrm>
+                    <a:prstGeom prst="rect"/>
+                  </pic:spPr>
+                </pic:pic>
+              </a:graphicData>
+            </a:graphic>
+          </wp:inline>
+        </w:drawing>
+      </w:r>
+    </w:p>
+    <w:p>
+      <w:pPr>
+        <w:spacing w:after="140"/>
+        <w:jc w:val="center"/>
+      </w:pPr>
+      <w:r>
+        <w:rPr>
+          <w:rFonts w:ascii="Heiti SC" w:hAnsi="Heiti SC" w:eastAsia="Heiti SC"/>
+          <w:color w:val="666666"/>
+          <w:sz w:val="17"/>
+        </w:rPr>
+        <w:t>图 5　`shared/vehicles` 下已建立的车型目录，Homepage 车型资产按产品代码归档。</w:t>
+      </w:r>
     </w:p>
     <w:p>
       <w:pPr>
@@ -4506,6 +4668,114 @@
     </w:p>
     <w:p>
       <w:pPr>
+        <w:spacing w:before="100" w:after="60"/>
+        <w:jc w:val="center"/>
+      </w:pPr>
+      <w:r>
+        <w:drawing>
+          <wp:inline xmlns:a="http://schemas.openxmlformats.org/drawingml/2006/main" xmlns:pic="http://schemas.openxmlformats.org/drawingml/2006/picture">
+            <wp:extent cx="3337560" cy="5741266"/>
+            <wp:docPr id="6" name="Picture 6" title="Global 市场目录" descr="Global 市场目录"/>
+            <wp:cNvGraphicFramePr>
+              <a:graphicFrameLocks noChangeAspect="1"/>
+            </wp:cNvGraphicFramePr>
+            <a:graphic>
+              <a:graphicData uri="http://schemas.openxmlformats.org/drawingml/2006/picture">
+                <pic:pic>
+                  <pic:nvPicPr>
+                    <pic:cNvPr id="0" name="04-global-markets.png"/>
+                    <pic:cNvPicPr/>
+                  </pic:nvPicPr>
+                  <pic:blipFill>
+                    <a:blip r:embed="rId16"/>
+                    <a:stretch>
+                      <a:fillRect/>
+                    </a:stretch>
+                  </pic:blipFill>
+                  <pic:spPr>
+                    <a:xfrm>
+                      <a:off x="0" y="0"/>
+                      <a:ext cx="3337560" cy="5741266"/>
+                    </a:xfrm>
+                    <a:prstGeom prst="rect"/>
+                  </pic:spPr>
+                </pic:pic>
+              </a:graphicData>
+            </a:graphic>
+          </wp:inline>
+        </w:drawing>
+      </w:r>
+    </w:p>
+    <w:p>
+      <w:pPr>
+        <w:spacing w:after="140"/>
+        <w:jc w:val="center"/>
+      </w:pPr>
+      <w:r>
+        <w:rPr>
+          <w:rFonts w:ascii="Heiti SC" w:hAnsi="Heiti SC" w:eastAsia="Heiti SC"/>
+          <w:color w:val="666666"/>
+          <w:sz w:val="17"/>
+        </w:rPr>
+        <w:t>图 6　Global 治理域当前包含 UAE、Saudi Arabia、Netherlands 和 Kuwait 市场目录。</w:t>
+      </w:r>
+    </w:p>
+    <w:p>
+      <w:pPr>
+        <w:spacing w:before="100" w:after="60"/>
+        <w:jc w:val="center"/>
+      </w:pPr>
+      <w:r>
+        <w:drawing>
+          <wp:inline xmlns:a="http://schemas.openxmlformats.org/drawingml/2006/main" xmlns:pic="http://schemas.openxmlformats.org/drawingml/2006/picture">
+            <wp:extent cx="3337560" cy="5741266"/>
+            <wp:docPr id="7" name="Picture 7" title="Central Asia 市场目录" descr="Central Asia 市场目录"/>
+            <wp:cNvGraphicFramePr>
+              <a:graphicFrameLocks noChangeAspect="1"/>
+            </wp:cNvGraphicFramePr>
+            <a:graphic>
+              <a:graphicData uri="http://schemas.openxmlformats.org/drawingml/2006/picture">
+                <pic:pic>
+                  <pic:nvPicPr>
+                    <pic:cNvPr id="0" name="05-central-asia-markets.png"/>
+                    <pic:cNvPicPr/>
+                  </pic:nvPicPr>
+                  <pic:blipFill>
+                    <a:blip r:embed="rId17"/>
+                    <a:stretch>
+                      <a:fillRect/>
+                    </a:stretch>
+                  </pic:blipFill>
+                  <pic:spPr>
+                    <a:xfrm>
+                      <a:off x="0" y="0"/>
+                      <a:ext cx="3337560" cy="5741266"/>
+                    </a:xfrm>
+                    <a:prstGeom prst="rect"/>
+                  </pic:spPr>
+                </pic:pic>
+              </a:graphicData>
+            </a:graphic>
+          </wp:inline>
+        </w:drawing>
+      </w:r>
+    </w:p>
+    <w:p>
+      <w:pPr>
+        <w:spacing w:after="140"/>
+        <w:jc w:val="center"/>
+      </w:pPr>
+      <w:r>
+        <w:rPr>
+          <w:rFonts w:ascii="Heiti SC" w:hAnsi="Heiti SC" w:eastAsia="Heiti SC"/>
+          <w:color w:val="666666"/>
+          <w:sz w:val="17"/>
+        </w:rPr>
+        <w:t>图 7　Central Asia 治理域中的 Kazakhstan 与 Uzbekistan 市场目录，与 Global 并列治理。</w:t>
+      </w:r>
+    </w:p>
+    <w:p>
+      <w:pPr>
         <w:pStyle w:val="Heading2"/>
       </w:pPr>
       <w:r>
@@ -6325,7 +6595,7 @@
         </w:rPr>
         <w:t>Adobe AEM Assets 发布说明：</w:t>
       </w:r>
-      <w:hyperlink r:id="rId13">
+      <w:hyperlink r:id="rId18">
         <w:r>
           <w:rPr>
             <w:rFonts w:ascii="Heiti SC" w:hAnsi="Heiti SC" w:eastAsia="Heiti SC"/>
@@ -6347,7 +6617,7 @@
         </w:rPr>
         <w:t>AEM Authoring 路径映射：</w:t>
       </w:r>
-      <w:hyperlink r:id="rId14">
+      <w:hyperlink r:id="rId19">
         <w:r>
           <w:rPr>
             <w:rFonts w:ascii="Heiti SC" w:hAnsi="Heiti SC" w:eastAsia="Heiti SC"/>
@@ -6369,7 +6639,7 @@
         </w:rPr>
         <w:t>EDS Media Assets：</w:t>
       </w:r>
-      <w:hyperlink r:id="rId15">
+      <w:hyperlink r:id="rId20">
         <w:r>
           <w:rPr>
             <w:rFonts w:ascii="Heiti SC" w:hAnsi="Heiti SC" w:eastAsia="Heiti SC"/>
@@ -8178,6 +8448,60 @@
           <w:b w:val="0"/>
         </w:rPr>
         <w:t>保存后在 Author 画布中确认图片加载，而不是只检查字段值。</w:t>
+      </w:r>
+    </w:p>
+    <w:p>
+      <w:pPr>
+        <w:spacing w:before="100" w:after="60"/>
+        <w:jc w:val="center"/>
+      </w:pPr>
+      <w:r>
+        <w:drawing>
+          <wp:inline xmlns:a="http://schemas.openxmlformats.org/drawingml/2006/main" xmlns:pic="http://schemas.openxmlformats.org/drawingml/2006/picture">
+            <wp:extent cx="5897880" cy="3686175"/>
+            <wp:docPr id="8" name="Picture 8" title="Homepage Universal Editor 桌面编辑界面" descr="Homepage Universal Editor 桌面编辑界面"/>
+            <wp:cNvGraphicFramePr>
+              <a:graphicFrameLocks noChangeAspect="1"/>
+            </wp:cNvGraphicFramePr>
+            <a:graphic>
+              <a:graphicData uri="http://schemas.openxmlformats.org/drawingml/2006/picture">
+                <pic:pic>
+                  <pic:nvPicPr>
+                    <pic:cNvPr id="0" name="06-homepage-universal-editor.png"/>
+                    <pic:cNvPicPr/>
+                  </pic:nvPicPr>
+                  <pic:blipFill>
+                    <a:blip r:embed="rId21"/>
+                    <a:stretch>
+                      <a:fillRect/>
+                    </a:stretch>
+                  </pic:blipFill>
+                  <pic:spPr>
+                    <a:xfrm>
+                      <a:off x="0" y="0"/>
+                      <a:ext cx="5897880" cy="3686175"/>
+                    </a:xfrm>
+                    <a:prstGeom prst="rect"/>
+                  </pic:spPr>
+                </pic:pic>
+              </a:graphicData>
+            </a:graphic>
+          </wp:inline>
+        </w:drawing>
+      </w:r>
+    </w:p>
+    <w:p>
+      <w:pPr>
+        <w:spacing w:after="140"/>
+        <w:jc w:val="center"/>
+      </w:pPr>
+      <w:r>
+        <w:rPr>
+          <w:rFonts w:ascii="Heiti SC" w:hAnsi="Heiti SC" w:eastAsia="Heiti SC"/>
+          <w:color w:val="666666"/>
+          <w:sz w:val="17"/>
+        </w:rPr>
+        <w:t>图 8　`language-master/en/homepage` 的 Universal Editor 桌面画布。Homepage Banner 和已迁移图片在 Author 中可见。</w:t>
       </w:r>
     </w:p>
     <w:p>

</xml_diff>